<commit_message>
committing additional changes to documentation
</commit_message>
<xml_diff>
--- a/p12-rt-ad-personalization-platform/docs/0. What I intend to do.docx
+++ b/p12-rt-ad-personalization-platform/docs/0. What I intend to do.docx
@@ -4,6 +4,13 @@
   <w:body>
     <w:sdt>
       <w:sdtPr>
+        <w:rPr>
+          <w:rFonts w:asciiTheme="minorHAnsi" w:eastAsiaTheme="minorHAnsi" w:hAnsiTheme="minorHAnsi" w:cstheme="minorBidi"/>
+          <w:color w:val="auto"/>
+          <w:sz w:val="28"/>
+          <w:szCs w:val="28"/>
+          <w:lang w:val="en-IN"/>
+        </w:rPr>
         <w:id w:val="-1934731978"/>
         <w:docPartObj>
           <w:docPartGallery w:val="Table of Contents"/>
@@ -12,14 +19,9 @@
       </w:sdtPr>
       <w:sdtEndPr>
         <w:rPr>
-          <w:rFonts w:asciiTheme="minorHAnsi" w:eastAsiaTheme="minorHAnsi" w:hAnsiTheme="minorHAnsi" w:cstheme="minorBidi"/>
           <w:b/>
           <w:bCs/>
           <w:noProof/>
-          <w:color w:val="auto"/>
-          <w:sz w:val="28"/>
-          <w:szCs w:val="28"/>
-          <w:lang w:val="en-IN"/>
         </w:rPr>
       </w:sdtEndPr>
       <w:sdtContent>
@@ -38,7 +40,13 @@
               <w:tab w:val="right" w:leader="dot" w:pos="9742"/>
             </w:tabs>
             <w:rPr>
+              <w:rFonts w:eastAsiaTheme="minorEastAsia"/>
               <w:noProof/>
+              <w:kern w:val="2"/>
+              <w:sz w:val="24"/>
+              <w:szCs w:val="24"/>
+              <w:lang w:eastAsia="en-IN" w:bidi="kn-IN"/>
+              <w14:ligatures w14:val="standardContextual"/>
             </w:rPr>
           </w:pPr>
           <w:r>
@@ -50,7 +58,7 @@
           <w:r>
             <w:fldChar w:fldCharType="separate"/>
           </w:r>
-          <w:hyperlink w:anchor="_Toc230625182" w:history="1">
+          <w:hyperlink w:anchor="_Toc231253075" w:history="1">
             <w:r>
               <w:rPr>
                 <w:rStyle w:val="Hyperlink"/>
@@ -77,7 +85,7 @@
                 <w:noProof/>
                 <w:webHidden/>
               </w:rPr>
-              <w:instrText xml:space="preserve"> PAGEREF _Toc230625182 \h </w:instrText>
+              <w:instrText xml:space="preserve"> PAGEREF _Toc231253075 \h </w:instrText>
             </w:r>
             <w:r>
               <w:rPr>
@@ -115,10 +123,16 @@
               <w:tab w:val="right" w:leader="dot" w:pos="9742"/>
             </w:tabs>
             <w:rPr>
+              <w:rFonts w:eastAsiaTheme="minorEastAsia"/>
               <w:noProof/>
+              <w:kern w:val="2"/>
+              <w:sz w:val="24"/>
+              <w:szCs w:val="24"/>
+              <w:lang w:eastAsia="en-IN" w:bidi="kn-IN"/>
+              <w14:ligatures w14:val="standardContextual"/>
             </w:rPr>
           </w:pPr>
-          <w:hyperlink w:anchor="_Toc230625183" w:history="1">
+          <w:hyperlink w:anchor="_Toc231253076" w:history="1">
             <w:r>
               <w:rPr>
                 <w:rStyle w:val="Hyperlink"/>
@@ -145,7 +159,7 @@
                 <w:noProof/>
                 <w:webHidden/>
               </w:rPr>
-              <w:instrText xml:space="preserve"> PAGEREF _Toc230625183 \h </w:instrText>
+              <w:instrText xml:space="preserve"> PAGEREF _Toc231253076 \h </w:instrText>
             </w:r>
             <w:r>
               <w:rPr>
@@ -183,10 +197,16 @@
               <w:tab w:val="right" w:leader="dot" w:pos="9742"/>
             </w:tabs>
             <w:rPr>
+              <w:rFonts w:eastAsiaTheme="minorEastAsia"/>
               <w:noProof/>
+              <w:kern w:val="2"/>
+              <w:sz w:val="24"/>
+              <w:szCs w:val="24"/>
+              <w:lang w:eastAsia="en-IN" w:bidi="kn-IN"/>
+              <w14:ligatures w14:val="standardContextual"/>
             </w:rPr>
           </w:pPr>
-          <w:hyperlink w:anchor="_Toc230625184" w:history="1">
+          <w:hyperlink w:anchor="_Toc231253077" w:history="1">
             <w:r>
               <w:rPr>
                 <w:rStyle w:val="Hyperlink"/>
@@ -213,7 +233,7 @@
                 <w:noProof/>
                 <w:webHidden/>
               </w:rPr>
-              <w:instrText xml:space="preserve"> PAGEREF _Toc230625184 \h </w:instrText>
+              <w:instrText xml:space="preserve"> PAGEREF _Toc231253077 \h </w:instrText>
             </w:r>
             <w:r>
               <w:rPr>
@@ -251,10 +271,16 @@
               <w:tab w:val="right" w:leader="dot" w:pos="9742"/>
             </w:tabs>
             <w:rPr>
+              <w:rFonts w:eastAsiaTheme="minorEastAsia"/>
               <w:noProof/>
+              <w:kern w:val="2"/>
+              <w:sz w:val="24"/>
+              <w:szCs w:val="24"/>
+              <w:lang w:eastAsia="en-IN" w:bidi="kn-IN"/>
+              <w14:ligatures w14:val="standardContextual"/>
             </w:rPr>
           </w:pPr>
-          <w:hyperlink w:anchor="_Toc230625185" w:history="1">
+          <w:hyperlink w:anchor="_Toc231253078" w:history="1">
             <w:r>
               <w:rPr>
                 <w:rStyle w:val="Hyperlink"/>
@@ -281,7 +307,7 @@
                 <w:noProof/>
                 <w:webHidden/>
               </w:rPr>
-              <w:instrText xml:space="preserve"> PAGEREF _Toc230625185 \h </w:instrText>
+              <w:instrText xml:space="preserve"> PAGEREF _Toc231253078 \h </w:instrText>
             </w:r>
             <w:r>
               <w:rPr>
@@ -319,10 +345,16 @@
               <w:tab w:val="right" w:leader="dot" w:pos="9742"/>
             </w:tabs>
             <w:rPr>
+              <w:rFonts w:eastAsiaTheme="minorEastAsia"/>
               <w:noProof/>
+              <w:kern w:val="2"/>
+              <w:sz w:val="24"/>
+              <w:szCs w:val="24"/>
+              <w:lang w:eastAsia="en-IN" w:bidi="kn-IN"/>
+              <w14:ligatures w14:val="standardContextual"/>
             </w:rPr>
           </w:pPr>
-          <w:hyperlink w:anchor="_Toc230625186" w:history="1">
+          <w:hyperlink w:anchor="_Toc231253079" w:history="1">
             <w:r>
               <w:rPr>
                 <w:rStyle w:val="Hyperlink"/>
@@ -349,7 +381,7 @@
                 <w:noProof/>
                 <w:webHidden/>
               </w:rPr>
-              <w:instrText xml:space="preserve"> PAGEREF _Toc230625186 \h </w:instrText>
+              <w:instrText xml:space="preserve"> PAGEREF _Toc231253079 \h </w:instrText>
             </w:r>
             <w:r>
               <w:rPr>
@@ -387,10 +419,16 @@
               <w:tab w:val="right" w:leader="dot" w:pos="9742"/>
             </w:tabs>
             <w:rPr>
+              <w:rFonts w:eastAsiaTheme="minorEastAsia"/>
               <w:noProof/>
+              <w:kern w:val="2"/>
+              <w:sz w:val="24"/>
+              <w:szCs w:val="24"/>
+              <w:lang w:eastAsia="en-IN" w:bidi="kn-IN"/>
+              <w14:ligatures w14:val="standardContextual"/>
             </w:rPr>
           </w:pPr>
-          <w:hyperlink w:anchor="_Toc230625187" w:history="1">
+          <w:hyperlink w:anchor="_Toc231253080" w:history="1">
             <w:r>
               <w:rPr>
                 <w:rStyle w:val="Hyperlink"/>
@@ -417,7 +455,7 @@
                 <w:noProof/>
                 <w:webHidden/>
               </w:rPr>
-              <w:instrText xml:space="preserve"> PAGEREF _Toc230625187 \h </w:instrText>
+              <w:instrText xml:space="preserve"> PAGEREF _Toc231253080 \h </w:instrText>
             </w:r>
             <w:r>
               <w:rPr>
@@ -455,10 +493,16 @@
               <w:tab w:val="right" w:leader="dot" w:pos="9742"/>
             </w:tabs>
             <w:rPr>
+              <w:rFonts w:eastAsiaTheme="minorEastAsia"/>
               <w:noProof/>
+              <w:kern w:val="2"/>
+              <w:sz w:val="24"/>
+              <w:szCs w:val="24"/>
+              <w:lang w:eastAsia="en-IN" w:bidi="kn-IN"/>
+              <w14:ligatures w14:val="standardContextual"/>
             </w:rPr>
           </w:pPr>
-          <w:hyperlink w:anchor="_Toc230625188" w:history="1">
+          <w:hyperlink w:anchor="_Toc231253081" w:history="1">
             <w:r>
               <w:rPr>
                 <w:rStyle w:val="Hyperlink"/>
@@ -485,7 +529,7 @@
                 <w:noProof/>
                 <w:webHidden/>
               </w:rPr>
-              <w:instrText xml:space="preserve"> PAGEREF _Toc230625188 \h </w:instrText>
+              <w:instrText xml:space="preserve"> PAGEREF _Toc231253081 \h </w:instrText>
             </w:r>
             <w:r>
               <w:rPr>
@@ -523,10 +567,16 @@
               <w:tab w:val="right" w:leader="dot" w:pos="9742"/>
             </w:tabs>
             <w:rPr>
+              <w:rFonts w:eastAsiaTheme="minorEastAsia"/>
               <w:noProof/>
+              <w:kern w:val="2"/>
+              <w:sz w:val="24"/>
+              <w:szCs w:val="24"/>
+              <w:lang w:eastAsia="en-IN" w:bidi="kn-IN"/>
+              <w14:ligatures w14:val="standardContextual"/>
             </w:rPr>
           </w:pPr>
-          <w:hyperlink w:anchor="_Toc230625189" w:history="1">
+          <w:hyperlink w:anchor="_Toc231253082" w:history="1">
             <w:r>
               <w:rPr>
                 <w:rStyle w:val="Hyperlink"/>
@@ -553,7 +603,7 @@
                 <w:noProof/>
                 <w:webHidden/>
               </w:rPr>
-              <w:instrText xml:space="preserve"> PAGEREF _Toc230625189 \h </w:instrText>
+              <w:instrText xml:space="preserve"> PAGEREF _Toc231253082 \h </w:instrText>
             </w:r>
             <w:r>
               <w:rPr>
@@ -591,10 +641,16 @@
               <w:tab w:val="right" w:leader="dot" w:pos="9742"/>
             </w:tabs>
             <w:rPr>
+              <w:rFonts w:eastAsiaTheme="minorEastAsia"/>
               <w:noProof/>
+              <w:kern w:val="2"/>
+              <w:sz w:val="24"/>
+              <w:szCs w:val="24"/>
+              <w:lang w:eastAsia="en-IN" w:bidi="kn-IN"/>
+              <w14:ligatures w14:val="standardContextual"/>
             </w:rPr>
           </w:pPr>
-          <w:hyperlink w:anchor="_Toc230625190" w:history="1">
+          <w:hyperlink w:anchor="_Toc231253083" w:history="1">
             <w:r>
               <w:rPr>
                 <w:rStyle w:val="Hyperlink"/>
@@ -621,7 +677,7 @@
                 <w:noProof/>
                 <w:webHidden/>
               </w:rPr>
-              <w:instrText xml:space="preserve"> PAGEREF _Toc230625190 \h </w:instrText>
+              <w:instrText xml:space="preserve"> PAGEREF _Toc231253083 \h </w:instrText>
             </w:r>
             <w:r>
               <w:rPr>
@@ -681,7 +737,7 @@
       <w:pPr>
         <w:pStyle w:val="Heading1"/>
       </w:pPr>
-      <w:bookmarkStart w:id="0" w:name="_Toc230625182"/>
+      <w:bookmarkStart w:id="0" w:name="_Toc231253075"/>
       <w:r>
         <w:lastRenderedPageBreak/>
         <w:t>The Right Scope</w:t>
@@ -690,22 +746,27 @@
         <w:t xml:space="preserve"> - </w:t>
       </w:r>
       <w:r>
-        <w:t>Your Project Goal</w:t>
+        <w:t>My</w:t>
+      </w:r>
+      <w:r>
+        <w:t xml:space="preserve"> Project Goal</w:t>
       </w:r>
       <w:bookmarkEnd w:id="0"/>
     </w:p>
     <w:p>
-      <w:r>
-        <w:t>Build:</w:t>
-      </w:r>
-    </w:p>
-    <w:p>
-      <w:pPr>
+      <w:pPr>
+        <w:spacing w:after="0"/>
         <w:rPr>
           <w:b/>
           <w:bCs/>
         </w:rPr>
       </w:pPr>
+      <w:r>
+        <w:t>Build</w:t>
+      </w:r>
+      <w:r>
+        <w:t xml:space="preserve"> a </w:t>
+      </w:r>
       <w:r>
         <w:rPr>
           <w:b/>
@@ -716,6 +777,89 @@
     </w:p>
     <w:p>
       <w:pPr>
+        <w:spacing w:after="0"/>
+      </w:pPr>
+      <w:r>
+        <w:t>Inspired by:</w:t>
+      </w:r>
+    </w:p>
+    <w:p>
+      <w:pPr>
+        <w:numPr>
+          <w:ilvl w:val="0"/>
+          <w:numId w:val="16"/>
+        </w:numPr>
+        <w:spacing w:after="0"/>
+      </w:pPr>
+      <w:r>
+        <w:t xml:space="preserve">Zalando Ads </w:t>
+      </w:r>
+    </w:p>
+    <w:p>
+      <w:pPr>
+        <w:numPr>
+          <w:ilvl w:val="0"/>
+          <w:numId w:val="16"/>
+        </w:numPr>
+        <w:spacing w:after="0"/>
+      </w:pPr>
+      <w:r>
+        <w:t xml:space="preserve">Meta Ads </w:t>
+      </w:r>
+    </w:p>
+    <w:p>
+      <w:pPr>
+        <w:numPr>
+          <w:ilvl w:val="0"/>
+          <w:numId w:val="16"/>
+        </w:numPr>
+        <w:spacing w:after="0"/>
+      </w:pPr>
+      <w:r>
+        <w:t xml:space="preserve">TikTok recommendations </w:t>
+      </w:r>
+    </w:p>
+    <w:p>
+      <w:pPr>
+        <w:numPr>
+          <w:ilvl w:val="0"/>
+          <w:numId w:val="16"/>
+        </w:numPr>
+        <w:spacing w:after="0"/>
+      </w:pPr>
+      <w:r>
+        <w:t xml:space="preserve">Amazon sponsored products </w:t>
+      </w:r>
+    </w:p>
+    <w:p>
+      <w:r>
+        <w:t>And</w:t>
+      </w:r>
+      <w:r>
+        <w:t xml:space="preserve"> simplified enough for</w:t>
+      </w:r>
+      <w:r>
+        <w:t xml:space="preserve"> a </w:t>
+      </w:r>
+      <w:r>
+        <w:t>single engineer</w:t>
+      </w:r>
+      <w:r>
+        <w:t xml:space="preserve">, </w:t>
+      </w:r>
+      <w:r>
+        <w:t>AWS free tier</w:t>
+      </w:r>
+      <w:r>
+        <w:t>, and in 6</w:t>
+      </w:r>
+      <w:r>
+        <w:t xml:space="preserve"> weeks</w:t>
+      </w:r>
+    </w:p>
+    <w:p>
+      <w:pPr>
+        <w:spacing w:after="0"/>
         <w:rPr>
           <w:b/>
           <w:bCs/>
@@ -726,93 +870,13 @@
           <w:b/>
           <w:bCs/>
         </w:rPr>
-        <w:t>Inspired by:</w:t>
-      </w:r>
-    </w:p>
-    <w:p>
-      <w:pPr>
-        <w:numPr>
-          <w:ilvl w:val="0"/>
-          <w:numId w:val="16"/>
-        </w:numPr>
-      </w:pPr>
-      <w:r>
-        <w:t xml:space="preserve">Zalando Ads </w:t>
-      </w:r>
-    </w:p>
-    <w:p>
-      <w:pPr>
-        <w:numPr>
-          <w:ilvl w:val="0"/>
-          <w:numId w:val="16"/>
-        </w:numPr>
-      </w:pPr>
-      <w:r>
-        <w:t xml:space="preserve">Meta Ads </w:t>
-      </w:r>
-    </w:p>
-    <w:p>
-      <w:pPr>
-        <w:numPr>
-          <w:ilvl w:val="0"/>
-          <w:numId w:val="16"/>
-        </w:numPr>
-      </w:pPr>
-      <w:r>
-        <w:t xml:space="preserve">TikTok recommendations </w:t>
-      </w:r>
-    </w:p>
-    <w:p>
-      <w:pPr>
-        <w:numPr>
-          <w:ilvl w:val="0"/>
-          <w:numId w:val="16"/>
-        </w:numPr>
-      </w:pPr>
-      <w:r>
-        <w:t xml:space="preserve">Amazon sponsored products </w:t>
-      </w:r>
-    </w:p>
-    <w:p>
-      <w:r>
-        <w:t>But simplified enough for:</w:t>
-      </w:r>
-    </w:p>
-    <w:p>
-      <w:pPr>
-        <w:numPr>
-          <w:ilvl w:val="0"/>
-          <w:numId w:val="17"/>
-        </w:numPr>
-      </w:pPr>
-      <w:r>
-        <w:t xml:space="preserve">single engineer </w:t>
-      </w:r>
-    </w:p>
-    <w:p>
-      <w:pPr>
-        <w:numPr>
-          <w:ilvl w:val="0"/>
-          <w:numId w:val="17"/>
-        </w:numPr>
-      </w:pPr>
-      <w:r>
-        <w:t xml:space="preserve">AWS free tier </w:t>
-      </w:r>
-    </w:p>
-    <w:p>
-      <w:pPr>
-        <w:numPr>
-          <w:ilvl w:val="0"/>
-          <w:numId w:val="17"/>
-        </w:numPr>
-      </w:pPr>
-      <w:r>
-        <w:t>3 weeks</w:t>
-      </w:r>
-    </w:p>
-    <w:p/>
-    <w:p>
+        <w:t>But why?</w:t>
+      </w:r>
+    </w:p>
+    <w:p>
+      <w:pPr>
+        <w:spacing w:after="0"/>
+      </w:pPr>
       <w:r>
         <w:t>F</w:t>
       </w:r>
@@ -836,6 +900,7 @@
           <w:ilvl w:val="0"/>
           <w:numId w:val="18"/>
         </w:numPr>
+        <w:spacing w:after="0"/>
       </w:pPr>
       <w:r>
         <w:t xml:space="preserve">real-time recommendation systems </w:t>
@@ -847,6 +912,7 @@
           <w:ilvl w:val="0"/>
           <w:numId w:val="18"/>
         </w:numPr>
+        <w:spacing w:after="0"/>
       </w:pPr>
       <w:r>
         <w:t xml:space="preserve">ad personalization </w:t>
@@ -858,6 +924,7 @@
           <w:ilvl w:val="0"/>
           <w:numId w:val="18"/>
         </w:numPr>
+        <w:spacing w:after="0"/>
       </w:pPr>
       <w:r>
         <w:t xml:space="preserve">ranking/retrieval systems </w:t>
@@ -869,6 +936,7 @@
           <w:ilvl w:val="0"/>
           <w:numId w:val="18"/>
         </w:numPr>
+        <w:spacing w:after="0"/>
       </w:pPr>
       <w:r>
         <w:t xml:space="preserve">low-latency inference </w:t>
@@ -880,6 +948,7 @@
           <w:ilvl w:val="0"/>
           <w:numId w:val="18"/>
         </w:numPr>
+        <w:spacing w:after="0"/>
       </w:pPr>
       <w:r>
         <w:t xml:space="preserve">high-volume ML platforms </w:t>
@@ -897,8 +966,26 @@
       </w:r>
     </w:p>
     <w:p>
-      <w:r>
-        <w:t xml:space="preserve">And based on your profile, you are unusually well-positioned to build a </w:t>
+      <w:pPr>
+        <w:spacing w:after="0"/>
+      </w:pPr>
+      <w:r>
+        <w:t>B</w:t>
+      </w:r>
+      <w:r>
+        <w:t xml:space="preserve">ased on </w:t>
+      </w:r>
+      <w:r>
+        <w:t xml:space="preserve">my </w:t>
+      </w:r>
+      <w:r>
+        <w:t xml:space="preserve">profile, </w:t>
+      </w:r>
+      <w:r>
+        <w:t xml:space="preserve">I am </w:t>
+      </w:r>
+      <w:r>
+        <w:t xml:space="preserve">well-positioned to build a </w:t>
       </w:r>
       <w:r>
         <w:rPr>
@@ -908,7 +995,13 @@
         <w:t>credible</w:t>
       </w:r>
       <w:r>
-        <w:t xml:space="preserve"> portfolio project here because your actual experience already overlaps heavily with:</w:t>
+        <w:t xml:space="preserve"> portfolio project here because </w:t>
+      </w:r>
+      <w:r>
+        <w:t xml:space="preserve">my </w:t>
+      </w:r>
+      <w:r>
+        <w:t>actual experience already overlaps with:</w:t>
       </w:r>
     </w:p>
     <w:p>
@@ -917,6 +1010,7 @@
           <w:ilvl w:val="0"/>
           <w:numId w:val="19"/>
         </w:numPr>
+        <w:spacing w:after="0"/>
       </w:pPr>
       <w:r>
         <w:t xml:space="preserve">feature platforms </w:t>
@@ -928,6 +1022,7 @@
           <w:ilvl w:val="0"/>
           <w:numId w:val="19"/>
         </w:numPr>
+        <w:spacing w:after="0"/>
       </w:pPr>
       <w:r>
         <w:t xml:space="preserve">retrieval/ranking systems </w:t>
@@ -939,6 +1034,7 @@
           <w:ilvl w:val="0"/>
           <w:numId w:val="19"/>
         </w:numPr>
+        <w:spacing w:after="0"/>
       </w:pPr>
       <w:r>
         <w:t xml:space="preserve">observability </w:t>
@@ -950,6 +1046,7 @@
           <w:ilvl w:val="0"/>
           <w:numId w:val="19"/>
         </w:numPr>
+        <w:spacing w:after="0"/>
       </w:pPr>
       <w:r>
         <w:t xml:space="preserve">MLOps </w:t>
@@ -961,9 +1058,9 @@
           <w:ilvl w:val="0"/>
           <w:numId w:val="19"/>
         </w:numPr>
-      </w:pPr>
-      <w:r>
-        <w:lastRenderedPageBreak/>
+        <w:spacing w:after="0"/>
+      </w:pPr>
+      <w:r>
         <w:t xml:space="preserve">event-driven architectures </w:t>
       </w:r>
     </w:p>
@@ -973,6 +1070,7 @@
           <w:ilvl w:val="0"/>
           <w:numId w:val="19"/>
         </w:numPr>
+        <w:spacing w:after="0"/>
       </w:pPr>
       <w:r>
         <w:t xml:space="preserve">SageMaker deployment </w:t>
@@ -984,6 +1082,7 @@
           <w:ilvl w:val="0"/>
           <w:numId w:val="19"/>
         </w:numPr>
+        <w:spacing w:after="0"/>
       </w:pPr>
       <w:r>
         <w:t xml:space="preserve">low-latency systems </w:t>
@@ -995,6 +1094,7 @@
           <w:ilvl w:val="0"/>
           <w:numId w:val="19"/>
         </w:numPr>
+        <w:spacing w:after="0"/>
       </w:pPr>
       <w:r>
         <w:t>personalization/relevance optimization</w:t>
@@ -1017,7 +1117,7 @@
       <w:pPr>
         <w:pStyle w:val="Heading1"/>
       </w:pPr>
-      <w:bookmarkStart w:id="1" w:name="_Toc230625183"/>
+      <w:bookmarkStart w:id="1" w:name="_Toc231253076"/>
       <w:r>
         <w:lastRenderedPageBreak/>
         <w:t>What I want to demonstrate?</w:t>
@@ -1025,6 +1125,9 @@
       <w:bookmarkEnd w:id="1"/>
     </w:p>
     <w:p>
+      <w:pPr>
+        <w:spacing w:after="0"/>
+      </w:pPr>
       <w:r>
         <w:t>The project should showcase:</w:t>
       </w:r>
@@ -1033,6 +1136,14 @@
       <w:tblPr>
         <w:tblW w:w="0" w:type="auto"/>
         <w:tblCellSpacing w:w="15" w:type="dxa"/>
+        <w:tblBorders>
+          <w:top w:val="single" w:sz="4" w:space="0" w:color="5B9BD5" w:themeColor="accent5"/>
+          <w:left w:val="single" w:sz="4" w:space="0" w:color="5B9BD5" w:themeColor="accent5"/>
+          <w:bottom w:val="single" w:sz="4" w:space="0" w:color="5B9BD5" w:themeColor="accent5"/>
+          <w:right w:val="single" w:sz="4" w:space="0" w:color="5B9BD5" w:themeColor="accent5"/>
+          <w:insideH w:val="single" w:sz="4" w:space="0" w:color="5B9BD5" w:themeColor="accent5"/>
+          <w:insideV w:val="single" w:sz="4" w:space="0" w:color="5B9BD5" w:themeColor="accent5"/>
+        </w:tblBorders>
         <w:tblCellMar>
           <w:top w:w="15" w:type="dxa"/>
           <w:left w:w="15" w:type="dxa"/>
@@ -1042,8 +1153,8 @@
         <w:tblLook w:val="04A0" w:firstRow="1" w:lastRow="0" w:firstColumn="1" w:lastColumn="0" w:noHBand="0" w:noVBand="1"/>
       </w:tblPr>
       <w:tblGrid>
-        <w:gridCol w:w="2512"/>
-        <w:gridCol w:w="3365"/>
+        <w:gridCol w:w="2830"/>
+        <w:gridCol w:w="4111"/>
       </w:tblGrid>
       <w:tr>
         <w:trPr>
@@ -1052,12 +1163,13 @@
         </w:trPr>
         <w:tc>
           <w:tcPr>
-            <w:tcW w:w="0" w:type="auto"/>
+            <w:tcW w:w="2785" w:type="dxa"/>
             <w:vAlign w:val="center"/>
             <w:hideMark/>
           </w:tcPr>
           <w:p>
             <w:pPr>
+              <w:spacing w:after="0"/>
               <w:rPr>
                 <w:b/>
                 <w:bCs/>
@@ -1074,12 +1186,13 @@
         </w:tc>
         <w:tc>
           <w:tcPr>
-            <w:tcW w:w="0" w:type="auto"/>
+            <w:tcW w:w="4066" w:type="dxa"/>
             <w:vAlign w:val="center"/>
             <w:hideMark/>
           </w:tcPr>
           <w:p>
             <w:pPr>
+              <w:spacing w:after="0"/>
               <w:rPr>
                 <w:b/>
                 <w:bCs/>
@@ -1101,11 +1214,14 @@
         </w:trPr>
         <w:tc>
           <w:tcPr>
-            <w:tcW w:w="0" w:type="auto"/>
+            <w:tcW w:w="2785" w:type="dxa"/>
             <w:vAlign w:val="center"/>
             <w:hideMark/>
           </w:tcPr>
           <w:p>
+            <w:pPr>
+              <w:spacing w:after="0"/>
+            </w:pPr>
             <w:r>
               <w:t>Problem framing</w:t>
             </w:r>
@@ -1113,11 +1229,14 @@
         </w:tc>
         <w:tc>
           <w:tcPr>
-            <w:tcW w:w="0" w:type="auto"/>
+            <w:tcW w:w="4066" w:type="dxa"/>
             <w:vAlign w:val="center"/>
             <w:hideMark/>
           </w:tcPr>
           <w:p>
+            <w:pPr>
+              <w:spacing w:after="0"/>
+            </w:pPr>
             <w:r>
               <w:t>Why personalization matters</w:t>
             </w:r>
@@ -1130,11 +1249,14 @@
         </w:trPr>
         <w:tc>
           <w:tcPr>
-            <w:tcW w:w="0" w:type="auto"/>
+            <w:tcW w:w="2785" w:type="dxa"/>
             <w:vAlign w:val="center"/>
             <w:hideMark/>
           </w:tcPr>
           <w:p>
+            <w:pPr>
+              <w:spacing w:after="0"/>
+            </w:pPr>
             <w:r>
               <w:t>Architecture</w:t>
             </w:r>
@@ -1142,11 +1264,14 @@
         </w:tc>
         <w:tc>
           <w:tcPr>
-            <w:tcW w:w="0" w:type="auto"/>
+            <w:tcW w:w="4066" w:type="dxa"/>
             <w:vAlign w:val="center"/>
             <w:hideMark/>
           </w:tcPr>
           <w:p>
+            <w:pPr>
+              <w:spacing w:after="0"/>
+            </w:pPr>
             <w:r>
               <w:t>Real-time ML system design</w:t>
             </w:r>
@@ -1159,11 +1284,14 @@
         </w:trPr>
         <w:tc>
           <w:tcPr>
-            <w:tcW w:w="0" w:type="auto"/>
+            <w:tcW w:w="2785" w:type="dxa"/>
             <w:vAlign w:val="center"/>
             <w:hideMark/>
           </w:tcPr>
           <w:p>
+            <w:pPr>
+              <w:spacing w:after="0"/>
+            </w:pPr>
             <w:r>
               <w:t>Retrieval</w:t>
             </w:r>
@@ -1171,11 +1299,14 @@
         </w:tc>
         <w:tc>
           <w:tcPr>
-            <w:tcW w:w="0" w:type="auto"/>
+            <w:tcW w:w="4066" w:type="dxa"/>
             <w:vAlign w:val="center"/>
             <w:hideMark/>
           </w:tcPr>
           <w:p>
+            <w:pPr>
+              <w:spacing w:after="0"/>
+            </w:pPr>
             <w:r>
               <w:t>Candidate generation</w:t>
             </w:r>
@@ -1188,11 +1319,14 @@
         </w:trPr>
         <w:tc>
           <w:tcPr>
-            <w:tcW w:w="0" w:type="auto"/>
+            <w:tcW w:w="2785" w:type="dxa"/>
             <w:vAlign w:val="center"/>
             <w:hideMark/>
           </w:tcPr>
           <w:p>
+            <w:pPr>
+              <w:spacing w:after="0"/>
+            </w:pPr>
             <w:r>
               <w:t>Ranking</w:t>
             </w:r>
@@ -1200,11 +1334,14 @@
         </w:tc>
         <w:tc>
           <w:tcPr>
-            <w:tcW w:w="0" w:type="auto"/>
+            <w:tcW w:w="4066" w:type="dxa"/>
             <w:vAlign w:val="center"/>
             <w:hideMark/>
           </w:tcPr>
           <w:p>
+            <w:pPr>
+              <w:spacing w:after="0"/>
+            </w:pPr>
             <w:r>
               <w:t>Personalized ranking</w:t>
             </w:r>
@@ -1217,11 +1354,14 @@
         </w:trPr>
         <w:tc>
           <w:tcPr>
-            <w:tcW w:w="0" w:type="auto"/>
+            <w:tcW w:w="2785" w:type="dxa"/>
             <w:vAlign w:val="center"/>
             <w:hideMark/>
           </w:tcPr>
           <w:p>
+            <w:pPr>
+              <w:spacing w:after="0"/>
+            </w:pPr>
             <w:r>
               <w:t>Streaming</w:t>
             </w:r>
@@ -1229,11 +1369,14 @@
         </w:tc>
         <w:tc>
           <w:tcPr>
-            <w:tcW w:w="0" w:type="auto"/>
+            <w:tcW w:w="4066" w:type="dxa"/>
             <w:vAlign w:val="center"/>
             <w:hideMark/>
           </w:tcPr>
           <w:p>
+            <w:pPr>
+              <w:spacing w:after="0"/>
+            </w:pPr>
             <w:r>
               <w:t>User event ingestion</w:t>
             </w:r>
@@ -1246,11 +1389,14 @@
         </w:trPr>
         <w:tc>
           <w:tcPr>
-            <w:tcW w:w="0" w:type="auto"/>
+            <w:tcW w:w="2785" w:type="dxa"/>
             <w:vAlign w:val="center"/>
             <w:hideMark/>
           </w:tcPr>
           <w:p>
+            <w:pPr>
+              <w:spacing w:after="0"/>
+            </w:pPr>
             <w:r>
               <w:t>Feature engineering</w:t>
             </w:r>
@@ -1258,11 +1404,14 @@
         </w:tc>
         <w:tc>
           <w:tcPr>
-            <w:tcW w:w="0" w:type="auto"/>
+            <w:tcW w:w="4066" w:type="dxa"/>
             <w:vAlign w:val="center"/>
             <w:hideMark/>
           </w:tcPr>
           <w:p>
+            <w:pPr>
+              <w:spacing w:after="0"/>
+            </w:pPr>
             <w:r>
               <w:t>Real-time + offline features</w:t>
             </w:r>
@@ -1275,11 +1424,14 @@
         </w:trPr>
         <w:tc>
           <w:tcPr>
-            <w:tcW w:w="0" w:type="auto"/>
+            <w:tcW w:w="2785" w:type="dxa"/>
             <w:vAlign w:val="center"/>
             <w:hideMark/>
           </w:tcPr>
           <w:p>
+            <w:pPr>
+              <w:spacing w:after="0"/>
+            </w:pPr>
             <w:r>
               <w:t>Serving</w:t>
             </w:r>
@@ -1287,11 +1439,14 @@
         </w:tc>
         <w:tc>
           <w:tcPr>
-            <w:tcW w:w="0" w:type="auto"/>
+            <w:tcW w:w="4066" w:type="dxa"/>
             <w:vAlign w:val="center"/>
             <w:hideMark/>
           </w:tcPr>
           <w:p>
+            <w:pPr>
+              <w:spacing w:after="0"/>
+            </w:pPr>
             <w:r>
               <w:t>Low-latency inference</w:t>
             </w:r>
@@ -1304,11 +1459,14 @@
         </w:trPr>
         <w:tc>
           <w:tcPr>
-            <w:tcW w:w="0" w:type="auto"/>
+            <w:tcW w:w="2785" w:type="dxa"/>
             <w:vAlign w:val="center"/>
             <w:hideMark/>
           </w:tcPr>
           <w:p>
+            <w:pPr>
+              <w:spacing w:after="0"/>
+            </w:pPr>
             <w:r>
               <w:t>MLOps</w:t>
             </w:r>
@@ -1316,11 +1474,14 @@
         </w:tc>
         <w:tc>
           <w:tcPr>
-            <w:tcW w:w="0" w:type="auto"/>
+            <w:tcW w:w="4066" w:type="dxa"/>
             <w:vAlign w:val="center"/>
             <w:hideMark/>
           </w:tcPr>
           <w:p>
+            <w:pPr>
+              <w:spacing w:after="0"/>
+            </w:pPr>
             <w:r>
               <w:t>CI/CD + monitoring</w:t>
             </w:r>
@@ -1333,11 +1494,14 @@
         </w:trPr>
         <w:tc>
           <w:tcPr>
-            <w:tcW w:w="0" w:type="auto"/>
+            <w:tcW w:w="2785" w:type="dxa"/>
             <w:vAlign w:val="center"/>
             <w:hideMark/>
           </w:tcPr>
           <w:p>
+            <w:pPr>
+              <w:spacing w:after="0"/>
+            </w:pPr>
             <w:r>
               <w:t>Trade-offs</w:t>
             </w:r>
@@ -1345,11 +1509,14 @@
         </w:tc>
         <w:tc>
           <w:tcPr>
-            <w:tcW w:w="0" w:type="auto"/>
+            <w:tcW w:w="4066" w:type="dxa"/>
             <w:vAlign w:val="center"/>
             <w:hideMark/>
           </w:tcPr>
           <w:p>
+            <w:pPr>
+              <w:spacing w:after="0"/>
+            </w:pPr>
             <w:r>
               <w:t>latency vs accuracy</w:t>
             </w:r>
@@ -1362,11 +1529,14 @@
         </w:trPr>
         <w:tc>
           <w:tcPr>
-            <w:tcW w:w="0" w:type="auto"/>
+            <w:tcW w:w="2785" w:type="dxa"/>
             <w:vAlign w:val="center"/>
             <w:hideMark/>
           </w:tcPr>
           <w:p>
+            <w:pPr>
+              <w:spacing w:after="0"/>
+            </w:pPr>
             <w:r>
               <w:t>Observability</w:t>
             </w:r>
@@ -1374,11 +1544,14 @@
         </w:tc>
         <w:tc>
           <w:tcPr>
-            <w:tcW w:w="0" w:type="auto"/>
+            <w:tcW w:w="4066" w:type="dxa"/>
             <w:vAlign w:val="center"/>
             <w:hideMark/>
           </w:tcPr>
           <w:p>
+            <w:pPr>
+              <w:spacing w:after="0"/>
+            </w:pPr>
             <w:r>
               <w:t>metrics and drift</w:t>
             </w:r>
@@ -1391,11 +1564,14 @@
         </w:trPr>
         <w:tc>
           <w:tcPr>
-            <w:tcW w:w="0" w:type="auto"/>
+            <w:tcW w:w="2785" w:type="dxa"/>
             <w:vAlign w:val="center"/>
             <w:hideMark/>
           </w:tcPr>
           <w:p>
+            <w:pPr>
+              <w:spacing w:after="0"/>
+            </w:pPr>
             <w:r>
               <w:t>Software Engineering</w:t>
             </w:r>
@@ -1403,11 +1579,14 @@
         </w:tc>
         <w:tc>
           <w:tcPr>
-            <w:tcW w:w="0" w:type="auto"/>
+            <w:tcW w:w="4066" w:type="dxa"/>
             <w:vAlign w:val="center"/>
             <w:hideMark/>
           </w:tcPr>
           <w:p>
+            <w:pPr>
+              <w:spacing w:after="0"/>
+            </w:pPr>
             <w:r>
               <w:t>modular architecture</w:t>
             </w:r>
@@ -1420,11 +1599,14 @@
         </w:trPr>
         <w:tc>
           <w:tcPr>
-            <w:tcW w:w="0" w:type="auto"/>
+            <w:tcW w:w="2785" w:type="dxa"/>
             <w:vAlign w:val="center"/>
             <w:hideMark/>
           </w:tcPr>
           <w:p>
+            <w:pPr>
+              <w:spacing w:after="0"/>
+            </w:pPr>
             <w:r>
               <w:t>Documentation</w:t>
             </w:r>
@@ -1432,11 +1614,14 @@
         </w:tc>
         <w:tc>
           <w:tcPr>
-            <w:tcW w:w="0" w:type="auto"/>
+            <w:tcW w:w="4066" w:type="dxa"/>
             <w:vAlign w:val="center"/>
             <w:hideMark/>
           </w:tcPr>
           <w:p>
+            <w:pPr>
+              <w:spacing w:after="0"/>
+            </w:pPr>
             <w:r>
               <w:t>principal-level clarity</w:t>
             </w:r>
@@ -1454,89 +1639,151 @@
       <w:pPr>
         <w:pStyle w:val="Heading1"/>
       </w:pPr>
-      <w:bookmarkStart w:id="2" w:name="_Toc230625184"/>
+      <w:bookmarkStart w:id="2" w:name="_Toc231253077"/>
       <w:r>
         <w:lastRenderedPageBreak/>
         <w:t>How will the basic architecture look like?</w:t>
       </w:r>
       <w:bookmarkEnd w:id="2"/>
     </w:p>
-    <w:p>
+    <w:p/>
+    <w:p>
+      <w:pPr>
+        <w:spacing w:after="0"/>
+        <w:jc w:val="center"/>
+      </w:pPr>
       <w:r>
         <w:t>User Events</w:t>
       </w:r>
-    </w:p>
-    <w:p>
+      <w:r>
+        <w:t xml:space="preserve"> </w:t>
+      </w:r>
       <w:r>
         <w:t>(click/view/cart)</w:t>
       </w:r>
     </w:p>
     <w:p>
-      <w:r>
-        <w:t xml:space="preserve">      ↓</w:t>
-      </w:r>
-    </w:p>
-    <w:p>
+      <w:pPr>
+        <w:spacing w:after="0"/>
+        <w:jc w:val="center"/>
+      </w:pPr>
+      <w:r>
+        <w:t>↓</w:t>
+      </w:r>
+    </w:p>
+    <w:p>
+      <w:pPr>
+        <w:spacing w:after="0"/>
+        <w:jc w:val="center"/>
+      </w:pPr>
       <w:r>
         <w:t>Event Stream (Kinesis simulated)</w:t>
       </w:r>
     </w:p>
     <w:p>
-      <w:r>
-        <w:t xml:space="preserve">      ↓</w:t>
-      </w:r>
-    </w:p>
-    <w:p>
+      <w:pPr>
+        <w:spacing w:after="0"/>
+        <w:jc w:val="center"/>
+      </w:pPr>
+      <w:r>
+        <w:t>↓</w:t>
+      </w:r>
+    </w:p>
+    <w:p>
+      <w:pPr>
+        <w:spacing w:after="0"/>
+        <w:jc w:val="center"/>
+      </w:pPr>
       <w:r>
         <w:t>Feature Pipeline</w:t>
       </w:r>
     </w:p>
     <w:p>
-      <w:r>
-        <w:t xml:space="preserve">      ↓</w:t>
-      </w:r>
-    </w:p>
-    <w:p>
+      <w:pPr>
+        <w:spacing w:after="0"/>
+        <w:jc w:val="center"/>
+      </w:pPr>
+      <w:r>
+        <w:t>↓</w:t>
+      </w:r>
+    </w:p>
+    <w:p>
+      <w:pPr>
+        <w:spacing w:after="0"/>
+        <w:jc w:val="center"/>
+      </w:pPr>
       <w:r>
         <w:t>Feature Store</w:t>
       </w:r>
     </w:p>
     <w:p>
-      <w:r>
-        <w:t xml:space="preserve">      ↓</w:t>
-      </w:r>
-    </w:p>
-    <w:p>
+      <w:pPr>
+        <w:spacing w:after="0"/>
+        <w:jc w:val="center"/>
+      </w:pPr>
+      <w:r>
+        <w:t>↓</w:t>
+      </w:r>
+    </w:p>
+    <w:p>
+      <w:pPr>
+        <w:spacing w:after="0"/>
+        <w:jc w:val="center"/>
+      </w:pPr>
       <w:r>
         <w:t>Candidate Retrieval</w:t>
       </w:r>
     </w:p>
     <w:p>
-      <w:r>
-        <w:t xml:space="preserve">      ↓</w:t>
-      </w:r>
-    </w:p>
-    <w:p>
+      <w:pPr>
+        <w:spacing w:after="0"/>
+        <w:jc w:val="center"/>
+      </w:pPr>
+      <w:r>
+        <w:t>↓</w:t>
+      </w:r>
+    </w:p>
+    <w:p>
+      <w:pPr>
+        <w:spacing w:after="0"/>
+        <w:jc w:val="center"/>
+      </w:pPr>
       <w:r>
         <w:t>Ranking Service</w:t>
       </w:r>
     </w:p>
     <w:p>
-      <w:r>
-        <w:t xml:space="preserve">      ↓</w:t>
-      </w:r>
-    </w:p>
-    <w:p>
+      <w:pPr>
+        <w:spacing w:after="0"/>
+        <w:jc w:val="center"/>
+      </w:pPr>
+      <w:r>
+        <w:t>↓</w:t>
+      </w:r>
+    </w:p>
+    <w:p>
+      <w:pPr>
+        <w:spacing w:after="0"/>
+        <w:jc w:val="center"/>
+      </w:pPr>
       <w:r>
         <w:t>Top-N Ads</w:t>
       </w:r>
     </w:p>
     <w:p>
-      <w:r>
-        <w:t xml:space="preserve">      ↓</w:t>
-      </w:r>
-    </w:p>
-    <w:p>
+      <w:pPr>
+        <w:spacing w:after="0"/>
+        <w:jc w:val="center"/>
+      </w:pPr>
+      <w:r>
+        <w:t>↓</w:t>
+      </w:r>
+    </w:p>
+    <w:p>
+      <w:pPr>
+        <w:spacing w:after="0"/>
+        <w:jc w:val="center"/>
+      </w:pPr>
       <w:r>
         <w:t>Feedback Loop</w:t>
       </w:r>
@@ -1558,7 +1805,7 @@
       <w:pPr>
         <w:pStyle w:val="Heading1"/>
       </w:pPr>
-      <w:bookmarkStart w:id="3" w:name="_Toc230625185"/>
+      <w:bookmarkStart w:id="3" w:name="_Toc231253078"/>
       <w:r>
         <w:lastRenderedPageBreak/>
         <w:t>What Tech Stack I am looking at?</w:t>
@@ -1584,6 +1831,15 @@
       <w:tblPr>
         <w:tblW w:w="0" w:type="auto"/>
         <w:tblCellSpacing w:w="15" w:type="dxa"/>
+        <w:tblBorders>
+          <w:top w:val="single" w:sz="4" w:space="0" w:color="5B9BD5" w:themeColor="accent5"/>
+          <w:left w:val="single" w:sz="4" w:space="0" w:color="5B9BD5" w:themeColor="accent5"/>
+          <w:bottom w:val="single" w:sz="4" w:space="0" w:color="5B9BD5" w:themeColor="accent5"/>
+          <w:right w:val="single" w:sz="4" w:space="0" w:color="5B9BD5" w:themeColor="accent5"/>
+          <w:insideH w:val="single" w:sz="4" w:space="0" w:color="5B9BD5" w:themeColor="accent5"/>
+          <w:insideV w:val="single" w:sz="4" w:space="0" w:color="5B9BD5" w:themeColor="accent5"/>
+        </w:tblBorders>
+        <w:tblLayout w:type="fixed"/>
         <w:tblCellMar>
           <w:top w:w="15" w:type="dxa"/>
           <w:left w:w="15" w:type="dxa"/>
@@ -1593,8 +1849,9 @@
         <w:tblLook w:val="04A0" w:firstRow="1" w:lastRow="0" w:firstColumn="1" w:lastColumn="0" w:noHBand="0" w:noVBand="1"/>
       </w:tblPr>
       <w:tblGrid>
-        <w:gridCol w:w="2406"/>
-        <w:gridCol w:w="3575"/>
+        <w:gridCol w:w="2830"/>
+        <w:gridCol w:w="3686"/>
+        <w:gridCol w:w="1701"/>
       </w:tblGrid>
       <w:tr>
         <w:trPr>
@@ -1603,12 +1860,13 @@
         </w:trPr>
         <w:tc>
           <w:tcPr>
-            <w:tcW w:w="0" w:type="auto"/>
+            <w:tcW w:w="2785" w:type="dxa"/>
             <w:vAlign w:val="center"/>
             <w:hideMark/>
           </w:tcPr>
           <w:p>
             <w:pPr>
+              <w:spacing w:after="0"/>
               <w:rPr>
                 <w:b/>
                 <w:bCs/>
@@ -1625,12 +1883,13 @@
         </w:tc>
         <w:tc>
           <w:tcPr>
-            <w:tcW w:w="0" w:type="auto"/>
+            <w:tcW w:w="3656" w:type="dxa"/>
             <w:vAlign w:val="center"/>
             <w:hideMark/>
           </w:tcPr>
           <w:p>
             <w:pPr>
+              <w:spacing w:after="0"/>
               <w:rPr>
                 <w:b/>
                 <w:bCs/>
@@ -1642,6 +1901,27 @@
                 <w:bCs/>
               </w:rPr>
               <w:t>Technology</w:t>
+            </w:r>
+          </w:p>
+        </w:tc>
+        <w:tc>
+          <w:tcPr>
+            <w:tcW w:w="1656" w:type="dxa"/>
+          </w:tcPr>
+          <w:p>
+            <w:pPr>
+              <w:spacing w:after="0"/>
+              <w:rPr>
+                <w:b/>
+                <w:bCs/>
+              </w:rPr>
+            </w:pPr>
+            <w:r>
+              <w:rPr>
+                <w:b/>
+                <w:bCs/>
+              </w:rPr>
+              <w:t xml:space="preserve">Version </w:t>
             </w:r>
           </w:p>
         </w:tc>
@@ -1652,11 +1932,14 @@
         </w:trPr>
         <w:tc>
           <w:tcPr>
-            <w:tcW w:w="0" w:type="auto"/>
+            <w:tcW w:w="2785" w:type="dxa"/>
             <w:vAlign w:val="center"/>
             <w:hideMark/>
           </w:tcPr>
           <w:p>
+            <w:pPr>
+              <w:spacing w:after="0"/>
+            </w:pPr>
             <w:r>
               <w:t>Language</w:t>
             </w:r>
@@ -1664,14 +1947,27 @@
         </w:tc>
         <w:tc>
           <w:tcPr>
-            <w:tcW w:w="0" w:type="auto"/>
+            <w:tcW w:w="3656" w:type="dxa"/>
             <w:vAlign w:val="center"/>
             <w:hideMark/>
           </w:tcPr>
           <w:p>
+            <w:pPr>
+              <w:spacing w:after="0"/>
+            </w:pPr>
             <w:r>
               <w:t>Python</w:t>
             </w:r>
+          </w:p>
+        </w:tc>
+        <w:tc>
+          <w:tcPr>
+            <w:tcW w:w="1656" w:type="dxa"/>
+          </w:tcPr>
+          <w:p>
+            <w:pPr>
+              <w:spacing w:after="0"/>
+            </w:pPr>
           </w:p>
         </w:tc>
       </w:tr>
@@ -1681,11 +1977,14 @@
         </w:trPr>
         <w:tc>
           <w:tcPr>
-            <w:tcW w:w="0" w:type="auto"/>
+            <w:tcW w:w="2785" w:type="dxa"/>
             <w:vAlign w:val="center"/>
             <w:hideMark/>
           </w:tcPr>
           <w:p>
+            <w:pPr>
+              <w:spacing w:after="0"/>
+            </w:pPr>
             <w:r>
               <w:t>API</w:t>
             </w:r>
@@ -1693,16 +1992,29 @@
         </w:tc>
         <w:tc>
           <w:tcPr>
-            <w:tcW w:w="0" w:type="auto"/>
+            <w:tcW w:w="3656" w:type="dxa"/>
             <w:vAlign w:val="center"/>
             <w:hideMark/>
           </w:tcPr>
           <w:p>
+            <w:pPr>
+              <w:spacing w:after="0"/>
+            </w:pPr>
             <w:proofErr w:type="spellStart"/>
             <w:r>
               <w:t>FastAPI</w:t>
             </w:r>
             <w:proofErr w:type="spellEnd"/>
+          </w:p>
+        </w:tc>
+        <w:tc>
+          <w:tcPr>
+            <w:tcW w:w="1656" w:type="dxa"/>
+          </w:tcPr>
+          <w:p>
+            <w:pPr>
+              <w:spacing w:after="0"/>
+            </w:pPr>
           </w:p>
         </w:tc>
       </w:tr>
@@ -1712,11 +2024,14 @@
         </w:trPr>
         <w:tc>
           <w:tcPr>
-            <w:tcW w:w="0" w:type="auto"/>
+            <w:tcW w:w="2785" w:type="dxa"/>
             <w:vAlign w:val="center"/>
             <w:hideMark/>
           </w:tcPr>
           <w:p>
+            <w:pPr>
+              <w:spacing w:after="0"/>
+            </w:pPr>
             <w:r>
               <w:t>Training</w:t>
             </w:r>
@@ -1724,11 +2039,14 @@
         </w:tc>
         <w:tc>
           <w:tcPr>
-            <w:tcW w:w="0" w:type="auto"/>
+            <w:tcW w:w="3656" w:type="dxa"/>
             <w:vAlign w:val="center"/>
             <w:hideMark/>
           </w:tcPr>
           <w:p>
+            <w:pPr>
+              <w:spacing w:after="0"/>
+            </w:pPr>
             <w:r>
               <w:t xml:space="preserve">Scikit-learn / </w:t>
             </w:r>
@@ -1737,6 +2055,16 @@
               <w:t>LightGBM</w:t>
             </w:r>
             <w:proofErr w:type="spellEnd"/>
+          </w:p>
+        </w:tc>
+        <w:tc>
+          <w:tcPr>
+            <w:tcW w:w="1656" w:type="dxa"/>
+          </w:tcPr>
+          <w:p>
+            <w:pPr>
+              <w:spacing w:after="0"/>
+            </w:pPr>
           </w:p>
         </w:tc>
       </w:tr>
@@ -1746,11 +2074,14 @@
         </w:trPr>
         <w:tc>
           <w:tcPr>
-            <w:tcW w:w="0" w:type="auto"/>
+            <w:tcW w:w="2785" w:type="dxa"/>
             <w:vAlign w:val="center"/>
             <w:hideMark/>
           </w:tcPr>
           <w:p>
+            <w:pPr>
+              <w:spacing w:after="0"/>
+            </w:pPr>
             <w:r>
               <w:t>Embeddings</w:t>
             </w:r>
@@ -1758,14 +2089,27 @@
         </w:tc>
         <w:tc>
           <w:tcPr>
-            <w:tcW w:w="0" w:type="auto"/>
+            <w:tcW w:w="3656" w:type="dxa"/>
             <w:vAlign w:val="center"/>
             <w:hideMark/>
           </w:tcPr>
           <w:p>
+            <w:pPr>
+              <w:spacing w:after="0"/>
+            </w:pPr>
             <w:r>
               <w:t>Sentence Transformers</w:t>
             </w:r>
+          </w:p>
+        </w:tc>
+        <w:tc>
+          <w:tcPr>
+            <w:tcW w:w="1656" w:type="dxa"/>
+          </w:tcPr>
+          <w:p>
+            <w:pPr>
+              <w:spacing w:after="0"/>
+            </w:pPr>
           </w:p>
         </w:tc>
       </w:tr>
@@ -1775,11 +2119,14 @@
         </w:trPr>
         <w:tc>
           <w:tcPr>
-            <w:tcW w:w="0" w:type="auto"/>
+            <w:tcW w:w="2785" w:type="dxa"/>
             <w:vAlign w:val="center"/>
             <w:hideMark/>
           </w:tcPr>
           <w:p>
+            <w:pPr>
+              <w:spacing w:after="0"/>
+            </w:pPr>
             <w:r>
               <w:t>Vector Search</w:t>
             </w:r>
@@ -1787,14 +2134,27 @@
         </w:tc>
         <w:tc>
           <w:tcPr>
-            <w:tcW w:w="0" w:type="auto"/>
+            <w:tcW w:w="3656" w:type="dxa"/>
             <w:vAlign w:val="center"/>
             <w:hideMark/>
           </w:tcPr>
           <w:p>
+            <w:pPr>
+              <w:spacing w:after="0"/>
+            </w:pPr>
             <w:r>
               <w:t>FAISS</w:t>
             </w:r>
+          </w:p>
+        </w:tc>
+        <w:tc>
+          <w:tcPr>
+            <w:tcW w:w="1656" w:type="dxa"/>
+          </w:tcPr>
+          <w:p>
+            <w:pPr>
+              <w:spacing w:after="0"/>
+            </w:pPr>
           </w:p>
         </w:tc>
       </w:tr>
@@ -1804,11 +2164,14 @@
         </w:trPr>
         <w:tc>
           <w:tcPr>
-            <w:tcW w:w="0" w:type="auto"/>
+            <w:tcW w:w="2785" w:type="dxa"/>
             <w:vAlign w:val="center"/>
             <w:hideMark/>
           </w:tcPr>
           <w:p>
+            <w:pPr>
+              <w:spacing w:after="0"/>
+            </w:pPr>
             <w:r>
               <w:t>Streaming</w:t>
             </w:r>
@@ -1816,14 +2179,27 @@
         </w:tc>
         <w:tc>
           <w:tcPr>
-            <w:tcW w:w="0" w:type="auto"/>
+            <w:tcW w:w="3656" w:type="dxa"/>
             <w:vAlign w:val="center"/>
             <w:hideMark/>
           </w:tcPr>
           <w:p>
+            <w:pPr>
+              <w:spacing w:after="0"/>
+            </w:pPr>
             <w:r>
               <w:t>Kinesis (or local Kafka if easier)</w:t>
             </w:r>
+          </w:p>
+        </w:tc>
+        <w:tc>
+          <w:tcPr>
+            <w:tcW w:w="1656" w:type="dxa"/>
+          </w:tcPr>
+          <w:p>
+            <w:pPr>
+              <w:spacing w:after="0"/>
+            </w:pPr>
           </w:p>
         </w:tc>
       </w:tr>
@@ -1833,11 +2209,14 @@
         </w:trPr>
         <w:tc>
           <w:tcPr>
-            <w:tcW w:w="0" w:type="auto"/>
+            <w:tcW w:w="2785" w:type="dxa"/>
             <w:vAlign w:val="center"/>
             <w:hideMark/>
           </w:tcPr>
           <w:p>
+            <w:pPr>
+              <w:spacing w:after="0"/>
+            </w:pPr>
             <w:r>
               <w:t>Storage</w:t>
             </w:r>
@@ -1845,14 +2224,27 @@
         </w:tc>
         <w:tc>
           <w:tcPr>
-            <w:tcW w:w="0" w:type="auto"/>
+            <w:tcW w:w="3656" w:type="dxa"/>
             <w:vAlign w:val="center"/>
             <w:hideMark/>
           </w:tcPr>
           <w:p>
+            <w:pPr>
+              <w:spacing w:after="0"/>
+            </w:pPr>
             <w:r>
               <w:t>S3</w:t>
             </w:r>
+          </w:p>
+        </w:tc>
+        <w:tc>
+          <w:tcPr>
+            <w:tcW w:w="1656" w:type="dxa"/>
+          </w:tcPr>
+          <w:p>
+            <w:pPr>
+              <w:spacing w:after="0"/>
+            </w:pPr>
           </w:p>
         </w:tc>
       </w:tr>
@@ -1862,11 +2254,14 @@
         </w:trPr>
         <w:tc>
           <w:tcPr>
-            <w:tcW w:w="0" w:type="auto"/>
+            <w:tcW w:w="2785" w:type="dxa"/>
             <w:vAlign w:val="center"/>
             <w:hideMark/>
           </w:tcPr>
           <w:p>
+            <w:pPr>
+              <w:spacing w:after="0"/>
+            </w:pPr>
             <w:r>
               <w:t>Features</w:t>
             </w:r>
@@ -1874,14 +2269,27 @@
         </w:tc>
         <w:tc>
           <w:tcPr>
-            <w:tcW w:w="0" w:type="auto"/>
+            <w:tcW w:w="3656" w:type="dxa"/>
             <w:vAlign w:val="center"/>
             <w:hideMark/>
           </w:tcPr>
           <w:p>
+            <w:pPr>
+              <w:spacing w:after="0"/>
+            </w:pPr>
             <w:r>
               <w:t>DynamoDB / Redis-like cache</w:t>
             </w:r>
+          </w:p>
+        </w:tc>
+        <w:tc>
+          <w:tcPr>
+            <w:tcW w:w="1656" w:type="dxa"/>
+          </w:tcPr>
+          <w:p>
+            <w:pPr>
+              <w:spacing w:after="0"/>
+            </w:pPr>
           </w:p>
         </w:tc>
       </w:tr>
@@ -1891,11 +2299,14 @@
         </w:trPr>
         <w:tc>
           <w:tcPr>
-            <w:tcW w:w="0" w:type="auto"/>
+            <w:tcW w:w="2785" w:type="dxa"/>
             <w:vAlign w:val="center"/>
             <w:hideMark/>
           </w:tcPr>
           <w:p>
+            <w:pPr>
+              <w:spacing w:after="0"/>
+            </w:pPr>
             <w:r>
               <w:t>Serving</w:t>
             </w:r>
@@ -1903,16 +2314,29 @@
         </w:tc>
         <w:tc>
           <w:tcPr>
-            <w:tcW w:w="0" w:type="auto"/>
+            <w:tcW w:w="3656" w:type="dxa"/>
             <w:vAlign w:val="center"/>
             <w:hideMark/>
           </w:tcPr>
           <w:p>
+            <w:pPr>
+              <w:spacing w:after="0"/>
+            </w:pPr>
             <w:proofErr w:type="spellStart"/>
             <w:r>
               <w:t>FastAPI</w:t>
             </w:r>
             <w:proofErr w:type="spellEnd"/>
+          </w:p>
+        </w:tc>
+        <w:tc>
+          <w:tcPr>
+            <w:tcW w:w="1656" w:type="dxa"/>
+          </w:tcPr>
+          <w:p>
+            <w:pPr>
+              <w:spacing w:after="0"/>
+            </w:pPr>
           </w:p>
         </w:tc>
       </w:tr>
@@ -1922,11 +2346,14 @@
         </w:trPr>
         <w:tc>
           <w:tcPr>
-            <w:tcW w:w="0" w:type="auto"/>
+            <w:tcW w:w="2785" w:type="dxa"/>
             <w:vAlign w:val="center"/>
             <w:hideMark/>
           </w:tcPr>
           <w:p>
+            <w:pPr>
+              <w:spacing w:after="0"/>
+            </w:pPr>
             <w:r>
               <w:t>Infra</w:t>
             </w:r>
@@ -1934,14 +2361,27 @@
         </w:tc>
         <w:tc>
           <w:tcPr>
-            <w:tcW w:w="0" w:type="auto"/>
+            <w:tcW w:w="3656" w:type="dxa"/>
             <w:vAlign w:val="center"/>
             <w:hideMark/>
           </w:tcPr>
           <w:p>
+            <w:pPr>
+              <w:spacing w:after="0"/>
+            </w:pPr>
             <w:r>
               <w:t>Docker</w:t>
             </w:r>
+          </w:p>
+        </w:tc>
+        <w:tc>
+          <w:tcPr>
+            <w:tcW w:w="1656" w:type="dxa"/>
+          </w:tcPr>
+          <w:p>
+            <w:pPr>
+              <w:spacing w:after="0"/>
+            </w:pPr>
           </w:p>
         </w:tc>
       </w:tr>
@@ -1951,11 +2391,14 @@
         </w:trPr>
         <w:tc>
           <w:tcPr>
-            <w:tcW w:w="0" w:type="auto"/>
+            <w:tcW w:w="2785" w:type="dxa"/>
             <w:vAlign w:val="center"/>
             <w:hideMark/>
           </w:tcPr>
           <w:p>
+            <w:pPr>
+              <w:spacing w:after="0"/>
+            </w:pPr>
             <w:r>
               <w:t>CI/CD</w:t>
             </w:r>
@@ -1963,14 +2406,27 @@
         </w:tc>
         <w:tc>
           <w:tcPr>
-            <w:tcW w:w="0" w:type="auto"/>
+            <w:tcW w:w="3656" w:type="dxa"/>
             <w:vAlign w:val="center"/>
             <w:hideMark/>
           </w:tcPr>
           <w:p>
+            <w:pPr>
+              <w:spacing w:after="0"/>
+            </w:pPr>
             <w:r>
               <w:t>GitHub Actions</w:t>
             </w:r>
+          </w:p>
+        </w:tc>
+        <w:tc>
+          <w:tcPr>
+            <w:tcW w:w="1656" w:type="dxa"/>
+          </w:tcPr>
+          <w:p>
+            <w:pPr>
+              <w:spacing w:after="0"/>
+            </w:pPr>
           </w:p>
         </w:tc>
       </w:tr>
@@ -1980,11 +2436,14 @@
         </w:trPr>
         <w:tc>
           <w:tcPr>
-            <w:tcW w:w="0" w:type="auto"/>
+            <w:tcW w:w="2785" w:type="dxa"/>
             <w:vAlign w:val="center"/>
             <w:hideMark/>
           </w:tcPr>
           <w:p>
+            <w:pPr>
+              <w:spacing w:after="0"/>
+            </w:pPr>
             <w:r>
               <w:t>Monitoring</w:t>
             </w:r>
@@ -1992,14 +2451,27 @@
         </w:tc>
         <w:tc>
           <w:tcPr>
-            <w:tcW w:w="0" w:type="auto"/>
+            <w:tcW w:w="3656" w:type="dxa"/>
             <w:vAlign w:val="center"/>
             <w:hideMark/>
           </w:tcPr>
           <w:p>
+            <w:pPr>
+              <w:spacing w:after="0"/>
+            </w:pPr>
             <w:r>
               <w:t>CloudWatch</w:t>
             </w:r>
+          </w:p>
+        </w:tc>
+        <w:tc>
+          <w:tcPr>
+            <w:tcW w:w="1656" w:type="dxa"/>
+          </w:tcPr>
+          <w:p>
+            <w:pPr>
+              <w:spacing w:after="0"/>
+            </w:pPr>
           </w:p>
         </w:tc>
       </w:tr>
@@ -2009,11 +2481,14 @@
         </w:trPr>
         <w:tc>
           <w:tcPr>
-            <w:tcW w:w="0" w:type="auto"/>
+            <w:tcW w:w="2785" w:type="dxa"/>
             <w:vAlign w:val="center"/>
             <w:hideMark/>
           </w:tcPr>
           <w:p>
+            <w:pPr>
+              <w:spacing w:after="0"/>
+            </w:pPr>
             <w:r>
               <w:t>Experiment Tracking</w:t>
             </w:r>
@@ -2021,14 +2496,27 @@
         </w:tc>
         <w:tc>
           <w:tcPr>
-            <w:tcW w:w="0" w:type="auto"/>
+            <w:tcW w:w="3656" w:type="dxa"/>
             <w:vAlign w:val="center"/>
             <w:hideMark/>
           </w:tcPr>
           <w:p>
+            <w:pPr>
+              <w:spacing w:after="0"/>
+            </w:pPr>
             <w:r>
               <w:t>MLflow local</w:t>
             </w:r>
+          </w:p>
+        </w:tc>
+        <w:tc>
+          <w:tcPr>
+            <w:tcW w:w="1656" w:type="dxa"/>
+          </w:tcPr>
+          <w:p>
+            <w:pPr>
+              <w:spacing w:after="0"/>
+            </w:pPr>
           </w:p>
         </w:tc>
       </w:tr>
@@ -2038,11 +2526,14 @@
         </w:trPr>
         <w:tc>
           <w:tcPr>
-            <w:tcW w:w="0" w:type="auto"/>
+            <w:tcW w:w="2785" w:type="dxa"/>
             <w:vAlign w:val="center"/>
             <w:hideMark/>
           </w:tcPr>
           <w:p>
+            <w:pPr>
+              <w:spacing w:after="0"/>
+            </w:pPr>
             <w:proofErr w:type="spellStart"/>
             <w:r>
               <w:t>IaC</w:t>
@@ -2052,14 +2543,27 @@
         </w:tc>
         <w:tc>
           <w:tcPr>
-            <w:tcW w:w="0" w:type="auto"/>
+            <w:tcW w:w="3656" w:type="dxa"/>
             <w:vAlign w:val="center"/>
             <w:hideMark/>
           </w:tcPr>
           <w:p>
+            <w:pPr>
+              <w:spacing w:after="0"/>
+            </w:pPr>
             <w:r>
               <w:t>Terraform (minimal)</w:t>
             </w:r>
+          </w:p>
+        </w:tc>
+        <w:tc>
+          <w:tcPr>
+            <w:tcW w:w="1656" w:type="dxa"/>
+          </w:tcPr>
+          <w:p>
+            <w:pPr>
+              <w:spacing w:after="0"/>
+            </w:pPr>
           </w:p>
         </w:tc>
       </w:tr>
@@ -2081,10 +2585,13 @@
       <w:pPr>
         <w:pStyle w:val="Heading1"/>
       </w:pPr>
-      <w:bookmarkStart w:id="4" w:name="_Toc230625186"/>
+      <w:bookmarkStart w:id="4" w:name="_Toc231253079"/>
       <w:r>
         <w:lastRenderedPageBreak/>
-        <w:t>What I intend to do?</w:t>
+        <w:t>How</w:t>
+      </w:r>
+      <w:r>
+        <w:t xml:space="preserve"> I intend to do?</w:t>
       </w:r>
       <w:bookmarkEnd w:id="4"/>
     </w:p>
@@ -2314,16 +2821,25 @@
       <w:pPr>
         <w:pStyle w:val="Heading1"/>
       </w:pPr>
-      <w:bookmarkStart w:id="5" w:name="_Toc230625187"/>
+      <w:bookmarkStart w:id="5" w:name="_Toc231253080"/>
       <w:r>
         <w:lastRenderedPageBreak/>
-        <w:t>How my repo will look like?</w:t>
+        <w:t xml:space="preserve">How </w:t>
+      </w:r>
+      <w:r>
+        <w:t xml:space="preserve">will </w:t>
+      </w:r>
+      <w:r>
+        <w:t>my repo will look like?</w:t>
       </w:r>
       <w:bookmarkEnd w:id="5"/>
     </w:p>
     <w:p/>
     <w:p>
       <w:r>
+        <w:rPr>
+          <w:noProof/>
+        </w:rPr>
         <w:drawing>
           <wp:inline distT="0" distB="0" distL="0" distR="0" wp14:anchorId="41EBA74C" wp14:editId="087DE8E7">
             <wp:extent cx="3302170" cy="5867702"/>
@@ -2371,7 +2887,7 @@
       <w:pPr>
         <w:pStyle w:val="Heading1"/>
       </w:pPr>
-      <w:bookmarkStart w:id="6" w:name="_Toc230625188"/>
+      <w:bookmarkStart w:id="6" w:name="_Toc231253081"/>
       <w:r>
         <w:lastRenderedPageBreak/>
         <w:t>How will I go about it?</w:t>
@@ -2391,8 +2907,47 @@
           <w:b/>
           <w:bCs/>
         </w:rPr>
-        <w:t>3-Week Execution Plan</w:t>
-      </w:r>
+        <w:t>6</w:t>
+      </w:r>
+      <w:r>
+        <w:rPr>
+          <w:b/>
+          <w:bCs/>
+        </w:rPr>
+        <w:t>-Week Execution Plan</w:t>
+      </w:r>
+      <w:r>
+        <w:rPr>
+          <w:b/>
+          <w:bCs/>
+        </w:rPr>
+        <w:t xml:space="preserve"> (revised from 3-week initial plan with additional features) *</w:t>
+      </w:r>
+    </w:p>
+    <w:p>
+      <w:pPr>
+        <w:spacing w:after="0"/>
+        <w:rPr>
+          <w:b/>
+          <w:bCs/>
+        </w:rPr>
+      </w:pPr>
+      <w:r>
+        <w:rPr>
+          <w:b/>
+          <w:bCs/>
+        </w:rPr>
+        <w:t>* (The schedule below needs to be updated)</w:t>
+      </w:r>
+    </w:p>
+    <w:p>
+      <w:pPr>
+        <w:spacing w:after="0"/>
+        <w:rPr>
+          <w:b/>
+          <w:bCs/>
+        </w:rPr>
+      </w:pPr>
     </w:p>
     <w:p>
       <w:pPr>
@@ -2662,14 +3217,15 @@
         </w:numPr>
         <w:spacing w:after="0"/>
       </w:pPr>
-      <w:proofErr w:type="spellStart"/>
-      <w:r>
-        <w:t>RetailRocket</w:t>
-      </w:r>
-      <w:proofErr w:type="spellEnd"/>
+      <w:r>
+        <w:t>Retail</w:t>
+      </w:r>
       <w:r>
         <w:t xml:space="preserve"> </w:t>
       </w:r>
+      <w:r>
+        <w:t xml:space="preserve">Rocket </w:t>
+      </w:r>
     </w:p>
     <w:p>
       <w:pPr>
@@ -2682,6 +3238,15 @@
       <w:r>
         <w:t xml:space="preserve">synthetic ad events </w:t>
       </w:r>
+    </w:p>
+    <w:p>
+      <w:pPr>
+        <w:spacing w:after="0"/>
+        <w:rPr>
+          <w:b/>
+          <w:bCs/>
+        </w:rPr>
+      </w:pPr>
     </w:p>
     <w:p>
       <w:pPr>
@@ -2829,38 +3394,32 @@
         <w:spacing w:after="0"/>
       </w:pPr>
       <w:r>
+        <w:lastRenderedPageBreak/>
         <w:t xml:space="preserve">ranking logic </w:t>
       </w:r>
     </w:p>
     <w:p>
       <w:pPr>
+        <w:spacing w:after="0"/>
         <w:rPr>
           <w:b/>
           <w:bCs/>
         </w:rPr>
       </w:pPr>
-      <w:r>
+    </w:p>
+    <w:p>
+      <w:pPr>
+        <w:spacing w:after="0"/>
         <w:rPr>
           <w:b/>
           <w:bCs/>
         </w:rPr>
-        <w:br w:type="page"/>
-      </w:r>
-    </w:p>
-    <w:p>
-      <w:pPr>
-        <w:spacing w:after="0"/>
+      </w:pPr>
+      <w:r>
         <w:rPr>
           <w:b/>
           <w:bCs/>
         </w:rPr>
-      </w:pPr>
-      <w:r>
-        <w:rPr>
-          <w:b/>
-          <w:bCs/>
-        </w:rPr>
-        <w:lastRenderedPageBreak/>
         <w:t>WEEK 3 — Productionization</w:t>
       </w:r>
     </w:p>
@@ -2998,10 +3557,22 @@
       <w:pPr>
         <w:pStyle w:val="Heading1"/>
       </w:pPr>
-      <w:bookmarkStart w:id="7" w:name="_Toc230625189"/>
+      <w:bookmarkStart w:id="7" w:name="_Toc231253082"/>
       <w:r>
         <w:lastRenderedPageBreak/>
-        <w:t>What will I focus on?</w:t>
+        <w:t xml:space="preserve">What will </w:t>
+      </w:r>
+      <w:r>
+        <w:t xml:space="preserve">the areas of </w:t>
+      </w:r>
+      <w:r>
+        <w:t xml:space="preserve">focus </w:t>
+      </w:r>
+      <w:r>
+        <w:t>will be</w:t>
+      </w:r>
+      <w:r>
+        <w:t>?</w:t>
       </w:r>
       <w:bookmarkEnd w:id="7"/>
     </w:p>
@@ -3018,16 +3589,117 @@
           <w:b/>
           <w:bCs/>
         </w:rPr>
-        <w:t>What Makes This Stand Out</w:t>
-      </w:r>
-    </w:p>
-    <w:p>
-      <w:pPr>
-        <w:spacing w:after="0"/>
-      </w:pPr>
-      <w:r>
-        <w:t>Your project should heavily emphasize:</w:t>
-      </w:r>
+        <w:t xml:space="preserve">What </w:t>
+      </w:r>
+      <w:r>
+        <w:rPr>
+          <w:b/>
+          <w:bCs/>
+        </w:rPr>
+        <w:t>m</w:t>
+      </w:r>
+      <w:r>
+        <w:rPr>
+          <w:b/>
+          <w:bCs/>
+        </w:rPr>
+        <w:t xml:space="preserve">akes </w:t>
+      </w:r>
+      <w:r>
+        <w:rPr>
+          <w:b/>
+          <w:bCs/>
+        </w:rPr>
+        <w:t>t</w:t>
+      </w:r>
+      <w:r>
+        <w:rPr>
+          <w:b/>
+          <w:bCs/>
+        </w:rPr>
+        <w:t>his</w:t>
+      </w:r>
+      <w:r>
+        <w:rPr>
+          <w:b/>
+          <w:bCs/>
+        </w:rPr>
+        <w:t xml:space="preserve"> project</w:t>
+      </w:r>
+      <w:r>
+        <w:rPr>
+          <w:b/>
+          <w:bCs/>
+        </w:rPr>
+        <w:t xml:space="preserve"> </w:t>
+      </w:r>
+      <w:r>
+        <w:rPr>
+          <w:b/>
+          <w:bCs/>
+        </w:rPr>
+        <w:t>s</w:t>
+      </w:r>
+      <w:r>
+        <w:rPr>
+          <w:b/>
+          <w:bCs/>
+        </w:rPr>
+        <w:t xml:space="preserve">tand </w:t>
+      </w:r>
+      <w:r>
+        <w:rPr>
+          <w:b/>
+          <w:bCs/>
+        </w:rPr>
+        <w:t>o</w:t>
+      </w:r>
+      <w:r>
+        <w:rPr>
+          <w:b/>
+          <w:bCs/>
+        </w:rPr>
+        <w:t>ut</w:t>
+      </w:r>
+      <w:r>
+        <w:rPr>
+          <w:b/>
+          <w:bCs/>
+        </w:rPr>
+        <w:t>?</w:t>
+      </w:r>
+    </w:p>
+    <w:p>
+      <w:pPr>
+        <w:spacing w:after="0"/>
+      </w:pPr>
+      <w:r>
+        <w:t xml:space="preserve">The </w:t>
+      </w:r>
+      <w:r>
+        <w:t xml:space="preserve">project </w:t>
+      </w:r>
+      <w:r>
+        <w:t xml:space="preserve">will </w:t>
+      </w:r>
+      <w:r>
+        <w:t>heavily emphasize</w:t>
+      </w:r>
+      <w:r>
+        <w:t xml:space="preserve"> on</w:t>
+      </w:r>
+      <w:r>
+        <w:t>:</w:t>
+      </w:r>
+    </w:p>
+    <w:p>
+      <w:pPr>
+        <w:spacing w:after="0"/>
+        <w:rPr>
+          <w:b/>
+          <w:bCs/>
+        </w:rPr>
+      </w:pPr>
     </w:p>
     <w:p>
       <w:pPr>
@@ -3238,6 +3910,11 @@
     <w:p>
       <w:pPr>
         <w:spacing w:after="0"/>
+      </w:pPr>
+    </w:p>
+    <w:p>
+      <w:pPr>
+        <w:spacing w:after="0"/>
         <w:rPr>
           <w:b/>
           <w:bCs/>
@@ -3478,8 +4155,13 @@
         <w:spacing w:after="0"/>
       </w:pPr>
       <w:r>
-        <w:t>Principal interviews LOVE this.</w:t>
-      </w:r>
+        <w:t xml:space="preserve">The document should effectively outline the trade-off decisions made in evolution of this system. </w:t>
+      </w:r>
+    </w:p>
+    <w:p>
+      <w:pPr>
+        <w:spacing w:after="0"/>
+      </w:pPr>
     </w:p>
     <w:p>
       <w:pPr>
@@ -3571,7 +4253,7 @@
       <w:pPr>
         <w:pStyle w:val="Heading1"/>
       </w:pPr>
-      <w:bookmarkStart w:id="8" w:name="_Toc230625190"/>
+      <w:bookmarkStart w:id="8" w:name="_Toc231253083"/>
       <w:r>
         <w:lastRenderedPageBreak/>
         <w:t>How will my MVP1 look like?</w:t>
@@ -3602,6 +4284,15 @@
           <w:bCs/>
         </w:rPr>
       </w:pPr>
+    </w:p>
+    <w:p>
+      <w:pPr>
+        <w:spacing w:after="0"/>
+        <w:rPr>
+          <w:b/>
+          <w:bCs/>
+        </w:rPr>
+      </w:pPr>
       <w:r>
         <w:rPr>
           <w:b/>
@@ -3694,6 +4385,15 @@
           <w:bCs/>
         </w:rPr>
       </w:pPr>
+    </w:p>
+    <w:p>
+      <w:pPr>
+        <w:spacing w:after="0"/>
+        <w:rPr>
+          <w:b/>
+          <w:bCs/>
+        </w:rPr>
+      </w:pPr>
       <w:r>
         <w:rPr>
           <w:b/>
@@ -3766,6 +4466,15 @@
           <w:bCs/>
         </w:rPr>
       </w:pPr>
+    </w:p>
+    <w:p>
+      <w:pPr>
+        <w:spacing w:after="0"/>
+        <w:rPr>
+          <w:b/>
+          <w:bCs/>
+        </w:rPr>
+      </w:pPr>
       <w:r>
         <w:rPr>
           <w:b/>
@@ -3976,6 +4685,7 @@
         <w:spacing w:after="0"/>
       </w:pPr>
       <w:r>
+        <w:lastRenderedPageBreak/>
         <w:t xml:space="preserve">feature freshness </w:t>
       </w:r>
     </w:p>
@@ -7438,6 +8148,7 @@
   <w:style w:type="character" w:default="1" w:styleId="DefaultParagraphFont">
     <w:name w:val="Default Paragraph Font"/>
     <w:uiPriority w:val="1"/>
+    <w:semiHidden/>
     <w:unhideWhenUsed/>
   </w:style>
   <w:style w:type="table" w:default="1" w:styleId="TableNormal">

</xml_diff>